<commit_message>
PV2 discount rate rework, continued formula reformatting
</commit_message>
<xml_diff>
--- a/EconAutomation/src/supporting_docs/econ_report_templates/PV_earnings_and_meds_report_template.docx
+++ b/EconAutomation/src/supporting_docs/econ_report_templates/PV_earnings_and_meds_report_template.docx
@@ -52,7 +52,7 @@
           <w:noProof/>
           <w:sz w:val="24"/>
         </w:rPr>
-        <w:t>May 8, 2026</w:t>
+        <w:t>May 18, 2026</w:t>
       </w:r>
       <w:r>
         <w:rPr>
@@ -274,19 +274,6 @@
         </w:rPr>
         <w:t xml:space="preserve"> }}</w:t>
       </w:r>
-    </w:p>
-    <w:p>
-      <w:pPr>
-        <w:widowControl w:val="0"/>
-        <w:autoSpaceDE w:val="0"/>
-        <w:autoSpaceDN w:val="0"/>
-        <w:adjustRightInd w:val="0"/>
-        <w:rPr>
-          <w:iCs/>
-          <w:sz w:val="24"/>
-          <w:szCs w:val="24"/>
-        </w:rPr>
-      </w:pPr>
     </w:p>
     <w:p>
       <w:pPr>
@@ -1181,7 +1168,25 @@
           <w:highlight w:val="red"/>
           <w:u w:val="single"/>
         </w:rPr>
-        <w:t>– {{ 1be_WLE_pretrial_credit }}</w:t>
+        <w:t>– {{ b</w:t>
+      </w:r>
+      <w:r>
+        <w:rPr>
+          <w:bCs/>
+          <w:sz w:val="24"/>
+          <w:highlight w:val="red"/>
+          <w:u w:val="single"/>
+        </w:rPr>
+        <w:t>1</w:t>
+      </w:r>
+      <w:r>
+        <w:rPr>
+          <w:bCs/>
+          <w:sz w:val="24"/>
+          <w:highlight w:val="red"/>
+          <w:u w:val="single"/>
+        </w:rPr>
+        <w:t>e_WLE_pretrial_credit }}</w:t>
       </w:r>
     </w:p>
     <w:p>
@@ -1638,7 +1643,15 @@
           <w:sz w:val="24"/>
           <w:highlight w:val="red"/>
         </w:rPr>
-        <w:t>1be_WLE_</w:t>
+        <w:t>b1e</w:t>
+      </w:r>
+      <w:r>
+        <w:rPr>
+          <w:bCs/>
+          <w:sz w:val="24"/>
+          <w:highlight w:val="red"/>
+        </w:rPr>
+        <w:t>_WLE_</w:t>
       </w:r>
       <w:r>
         <w:rPr>
@@ -1795,7 +1808,23 @@
           <w:sz w:val="24"/>
           <w:highlight w:val="red"/>
         </w:rPr>
-        <w:t>{{ 1be_WLE_posttrial_</w:t>
+        <w:t xml:space="preserve">{{ </w:t>
+      </w:r>
+      <w:r>
+        <w:rPr>
+          <w:bCs/>
+          <w:sz w:val="24"/>
+          <w:highlight w:val="red"/>
+        </w:rPr>
+        <w:t>b1e</w:t>
+      </w:r>
+      <w:r>
+        <w:rPr>
+          <w:bCs/>
+          <w:sz w:val="24"/>
+          <w:highlight w:val="red"/>
+        </w:rPr>
+        <w:t>_WLE_posttrial_</w:t>
       </w:r>
       <w:r>
         <w:rPr>
@@ -1980,6 +2009,7 @@
           <w:bCs/>
           <w:sz w:val="24"/>
         </w:rPr>
+        <w:lastRenderedPageBreak/>
         <w:t xml:space="preserve">Meals loss from trial is </w:t>
       </w:r>
       <w:r>
@@ -2486,6 +2516,21 @@
     </w:p>
     <w:p>
       <w:pPr>
+        <w:rPr>
+          <w:bCs/>
+          <w:sz w:val="24"/>
+        </w:rPr>
+      </w:pPr>
+      <w:r>
+        <w:rPr>
+          <w:bCs/>
+          <w:sz w:val="24"/>
+        </w:rPr>
+        <w:t>{%- if -%}</w:t>
+      </w:r>
+    </w:p>
+    <w:p>
+      <w:pPr>
         <w:numPr>
           <w:ilvl w:val="0"/>
           <w:numId w:val="1"/>
@@ -2550,27 +2595,27 @@
     </w:p>
     <w:p>
       <w:pPr>
-        <w:tabs>
-          <w:tab w:val="left" w:pos="720"/>
-          <w:tab w:val="left" w:pos="1440"/>
-          <w:tab w:val="left" w:pos="2160"/>
-          <w:tab w:val="left" w:pos="2880"/>
-          <w:tab w:val="left" w:pos="3600"/>
-          <w:tab w:val="left" w:pos="4320"/>
-          <w:tab w:val="left" w:pos="5040"/>
-          <w:tab w:val="left" w:pos="5760"/>
-          <w:tab w:val="left" w:pos="6480"/>
-          <w:tab w:val="left" w:pos="7200"/>
-          <w:tab w:val="left" w:pos="7920"/>
-        </w:tabs>
-        <w:suppressAutoHyphens/>
-        <w:ind w:left="1440" w:right="1260"/>
-        <w:jc w:val="both"/>
-        <w:rPr>
-          <w:bCs/>
-          <w:sz w:val="24"/>
-        </w:rPr>
-      </w:pPr>
+        <w:pStyle w:val="ListParagraph"/>
+        <w:rPr>
+          <w:bCs/>
+          <w:sz w:val="24"/>
+        </w:rPr>
+      </w:pPr>
+    </w:p>
+    <w:p>
+      <w:pPr>
+        <w:rPr>
+          <w:bCs/>
+          <w:sz w:val="24"/>
+        </w:rPr>
+      </w:pPr>
+      <w:r>
+        <w:rPr>
+          <w:bCs/>
+          <w:sz w:val="24"/>
+        </w:rPr>
+        <w:t>{%- if -%}</w:t>
+      </w:r>
     </w:p>
     <w:p>
       <w:pPr>
@@ -2604,7 +2649,7 @@
           <w:bCs/>
           <w:sz w:val="24"/>
         </w:rPr>
-        <w:t xml:space="preserve">Without return to gainful employment, the loss from trial is </w:t>
+        <w:t xml:space="preserve">Benefits loss to trial is </w:t>
       </w:r>
       <w:r>
         <w:rPr>
@@ -2612,26 +2657,39 @@
           <w:sz w:val="24"/>
           <w:u w:val="single"/>
         </w:rPr>
-        <w:t>{</w:t>
-      </w:r>
-      <w:commentRangeStart w:id="15"/>
+        <w:t xml:space="preserve">{{r </w:t>
+      </w:r>
       <w:r>
         <w:rPr>
           <w:bCs/>
           <w:sz w:val="24"/>
           <w:u w:val="single"/>
         </w:rPr>
-        <w:t>{r b2e_WLE_posttrial_loss_notax }}</w:t>
-      </w:r>
-      <w:commentRangeEnd w:id="15"/>
-      <w:r>
-        <w:rPr>
-          <w:rStyle w:val="CommentReference"/>
-          <w:bCs/>
-          <w:sz w:val="24"/>
-          <w:szCs w:val="20"/>
-        </w:rPr>
-        <w:commentReference w:id="15"/>
+        <w:t>b2e_WLE_pretrial_</w:t>
+      </w:r>
+      <w:r>
+        <w:rPr>
+          <w:bCs/>
+          <w:sz w:val="24"/>
+          <w:u w:val="single"/>
+        </w:rPr>
+        <w:t>benefits</w:t>
+      </w:r>
+      <w:r>
+        <w:rPr>
+          <w:bCs/>
+          <w:sz w:val="24"/>
+          <w:u w:val="single"/>
+        </w:rPr>
+        <w:t>_notax</w:t>
+      </w:r>
+      <w:r>
+        <w:rPr>
+          <w:bCs/>
+          <w:sz w:val="24"/>
+          <w:u w:val="single"/>
+        </w:rPr>
+        <w:t xml:space="preserve"> }}</w:t>
       </w:r>
     </w:p>
     <w:p>
@@ -2657,6 +2715,154 @@
           <w:sz w:val="24"/>
         </w:rPr>
       </w:pPr>
+    </w:p>
+    <w:p>
+      <w:pPr>
+        <w:tabs>
+          <w:tab w:val="left" w:pos="720"/>
+          <w:tab w:val="left" w:pos="1440"/>
+          <w:tab w:val="left" w:pos="2160"/>
+          <w:tab w:val="left" w:pos="2880"/>
+          <w:tab w:val="left" w:pos="3600"/>
+          <w:tab w:val="left" w:pos="4320"/>
+          <w:tab w:val="left" w:pos="5040"/>
+          <w:tab w:val="left" w:pos="5760"/>
+          <w:tab w:val="left" w:pos="6480"/>
+          <w:tab w:val="left" w:pos="7200"/>
+          <w:tab w:val="left" w:pos="7920"/>
+        </w:tabs>
+        <w:suppressAutoHyphens/>
+        <w:ind w:right="1260"/>
+        <w:jc w:val="both"/>
+        <w:rPr>
+          <w:bCs/>
+          <w:sz w:val="24"/>
+        </w:rPr>
+      </w:pPr>
+      <w:r>
+        <w:rPr>
+          <w:bCs/>
+          <w:sz w:val="24"/>
+        </w:rPr>
+        <w:t>{%- if -%}</w:t>
+      </w:r>
+    </w:p>
+    <w:p>
+      <w:pPr>
+        <w:numPr>
+          <w:ilvl w:val="0"/>
+          <w:numId w:val="1"/>
+        </w:numPr>
+        <w:tabs>
+          <w:tab w:val="left" w:pos="720"/>
+          <w:tab w:val="left" w:pos="1440"/>
+          <w:tab w:val="left" w:pos="2160"/>
+          <w:tab w:val="left" w:pos="2880"/>
+          <w:tab w:val="left" w:pos="3600"/>
+          <w:tab w:val="left" w:pos="4320"/>
+          <w:tab w:val="left" w:pos="5040"/>
+          <w:tab w:val="left" w:pos="5760"/>
+          <w:tab w:val="left" w:pos="6480"/>
+          <w:tab w:val="left" w:pos="7200"/>
+          <w:tab w:val="left" w:pos="7920"/>
+        </w:tabs>
+        <w:suppressAutoHyphens/>
+        <w:ind w:right="1260"/>
+        <w:jc w:val="both"/>
+        <w:rPr>
+          <w:bCs/>
+          <w:sz w:val="24"/>
+        </w:rPr>
+      </w:pPr>
+      <w:r>
+        <w:rPr>
+          <w:bCs/>
+          <w:sz w:val="24"/>
+        </w:rPr>
+        <w:t xml:space="preserve">Without return to gainful employment, the loss from trial is </w:t>
+      </w:r>
+      <w:r>
+        <w:rPr>
+          <w:bCs/>
+          <w:sz w:val="24"/>
+          <w:u w:val="single"/>
+        </w:rPr>
+        <w:t>{</w:t>
+      </w:r>
+      <w:commentRangeStart w:id="15"/>
+      <w:r>
+        <w:rPr>
+          <w:bCs/>
+          <w:sz w:val="24"/>
+          <w:u w:val="single"/>
+        </w:rPr>
+        <w:t>{r b2e_WLE_posttrial_loss_notax }}</w:t>
+      </w:r>
+      <w:commentRangeEnd w:id="15"/>
+      <w:r>
+        <w:rPr>
+          <w:rStyle w:val="CommentReference"/>
+          <w:bCs/>
+          <w:sz w:val="24"/>
+          <w:szCs w:val="20"/>
+        </w:rPr>
+        <w:commentReference w:id="15"/>
+      </w:r>
+    </w:p>
+    <w:p>
+      <w:pPr>
+        <w:tabs>
+          <w:tab w:val="left" w:pos="720"/>
+          <w:tab w:val="left" w:pos="1440"/>
+          <w:tab w:val="left" w:pos="2160"/>
+          <w:tab w:val="left" w:pos="2880"/>
+          <w:tab w:val="left" w:pos="3600"/>
+          <w:tab w:val="left" w:pos="4320"/>
+          <w:tab w:val="left" w:pos="5040"/>
+          <w:tab w:val="left" w:pos="5760"/>
+          <w:tab w:val="left" w:pos="6480"/>
+          <w:tab w:val="left" w:pos="7200"/>
+          <w:tab w:val="left" w:pos="7920"/>
+        </w:tabs>
+        <w:suppressAutoHyphens/>
+        <w:ind w:right="1260"/>
+        <w:jc w:val="both"/>
+        <w:rPr>
+          <w:bCs/>
+          <w:sz w:val="24"/>
+        </w:rPr>
+      </w:pPr>
+    </w:p>
+    <w:p>
+      <w:pPr>
+        <w:tabs>
+          <w:tab w:val="left" w:pos="720"/>
+          <w:tab w:val="left" w:pos="1440"/>
+          <w:tab w:val="left" w:pos="2160"/>
+          <w:tab w:val="left" w:pos="2880"/>
+          <w:tab w:val="left" w:pos="3600"/>
+          <w:tab w:val="left" w:pos="4320"/>
+          <w:tab w:val="left" w:pos="5040"/>
+          <w:tab w:val="left" w:pos="5760"/>
+          <w:tab w:val="left" w:pos="6480"/>
+          <w:tab w:val="left" w:pos="7200"/>
+          <w:tab w:val="left" w:pos="7920"/>
+        </w:tabs>
+        <w:suppressAutoHyphens/>
+        <w:ind w:right="1260"/>
+        <w:jc w:val="both"/>
+        <w:rPr>
+          <w:bCs/>
+          <w:sz w:val="24"/>
+        </w:rPr>
+      </w:pPr>
+      <w:r>
+        <w:rPr>
+          <w:bCs/>
+          <w:sz w:val="24"/>
+        </w:rPr>
+        <w:t>{%- if -%}</w:t>
+      </w:r>
     </w:p>
     <w:p>
       <w:pPr>
@@ -2698,7 +2904,7 @@
           <w:sz w:val="24"/>
           <w:highlight w:val="red"/>
         </w:rPr>
-        <w:t>{{ 1be_WLE_posttrial_</w:t>
+        <w:t xml:space="preserve">{{ </w:t>
       </w:r>
       <w:r>
         <w:rPr>
@@ -2706,6 +2912,22 @@
           <w:sz w:val="24"/>
           <w:highlight w:val="red"/>
         </w:rPr>
+        <w:t>b1e</w:t>
+      </w:r>
+      <w:r>
+        <w:rPr>
+          <w:bCs/>
+          <w:sz w:val="24"/>
+          <w:highlight w:val="red"/>
+        </w:rPr>
+        <w:t>_WLE_posttrial_</w:t>
+      </w:r>
+      <w:r>
+        <w:rPr>
+          <w:bCs/>
+          <w:sz w:val="24"/>
+          <w:highlight w:val="red"/>
+        </w:rPr>
         <w:t>credit</w:t>
       </w:r>
       <w:r>
@@ -2721,7 +2943,7 @@
           <w:bCs/>
           <w:sz w:val="24"/>
         </w:rPr>
-        <w:t xml:space="preserve"> (low post-trail EC), the</w:t>
+        <w:t>, the</w:t>
       </w:r>
       <w:r>
         <w:rPr>
@@ -2737,6 +2959,61 @@
           <w:u w:val="single"/>
         </w:rPr>
         <w:t>{{r b2e_posttrial_loss_adj }}</w:t>
+      </w:r>
+    </w:p>
+    <w:p>
+      <w:pPr>
+        <w:tabs>
+          <w:tab w:val="left" w:pos="720"/>
+          <w:tab w:val="left" w:pos="1440"/>
+          <w:tab w:val="left" w:pos="2160"/>
+          <w:tab w:val="left" w:pos="2880"/>
+          <w:tab w:val="left" w:pos="3600"/>
+          <w:tab w:val="left" w:pos="4320"/>
+          <w:tab w:val="left" w:pos="5040"/>
+          <w:tab w:val="left" w:pos="5760"/>
+          <w:tab w:val="left" w:pos="6480"/>
+          <w:tab w:val="left" w:pos="7200"/>
+          <w:tab w:val="left" w:pos="7920"/>
+        </w:tabs>
+        <w:suppressAutoHyphens/>
+        <w:ind w:right="1260"/>
+        <w:jc w:val="both"/>
+        <w:rPr>
+          <w:bCs/>
+          <w:sz w:val="24"/>
+        </w:rPr>
+      </w:pPr>
+    </w:p>
+    <w:p>
+      <w:pPr>
+        <w:tabs>
+          <w:tab w:val="left" w:pos="720"/>
+          <w:tab w:val="left" w:pos="1440"/>
+          <w:tab w:val="left" w:pos="2160"/>
+          <w:tab w:val="left" w:pos="2880"/>
+          <w:tab w:val="left" w:pos="3600"/>
+          <w:tab w:val="left" w:pos="4320"/>
+          <w:tab w:val="left" w:pos="5040"/>
+          <w:tab w:val="left" w:pos="5760"/>
+          <w:tab w:val="left" w:pos="6480"/>
+          <w:tab w:val="left" w:pos="7200"/>
+          <w:tab w:val="left" w:pos="7920"/>
+        </w:tabs>
+        <w:suppressAutoHyphens/>
+        <w:ind w:right="1260"/>
+        <w:jc w:val="both"/>
+        <w:rPr>
+          <w:bCs/>
+          <w:sz w:val="24"/>
+        </w:rPr>
+      </w:pPr>
+      <w:r>
+        <w:rPr>
+          <w:bCs/>
+          <w:sz w:val="24"/>
+        </w:rPr>
+        <w:t>{%- if -%}</w:t>
       </w:r>
     </w:p>
     <w:p>
@@ -2779,7 +3056,23 @@
           <w:sz w:val="24"/>
           <w:highlight w:val="red"/>
         </w:rPr>
-        <w:t>{{ 1be_WLE_posttrial_</w:t>
+        <w:t xml:space="preserve">{{ </w:t>
+      </w:r>
+      <w:r>
+        <w:rPr>
+          <w:bCs/>
+          <w:sz w:val="24"/>
+          <w:highlight w:val="red"/>
+        </w:rPr>
+        <w:t>b1e</w:t>
+      </w:r>
+      <w:r>
+        <w:rPr>
+          <w:bCs/>
+          <w:sz w:val="24"/>
+          <w:highlight w:val="red"/>
+        </w:rPr>
+        <w:t>_WLE_posttrial_</w:t>
       </w:r>
       <w:r>
         <w:rPr>
@@ -2898,6 +3191,42 @@
     </w:p>
     <w:p>
       <w:pPr>
+        <w:rPr>
+          <w:bCs/>
+          <w:sz w:val="24"/>
+        </w:rPr>
+      </w:pPr>
+      <w:r>
+        <w:rPr>
+          <w:bCs/>
+          <w:sz w:val="24"/>
+        </w:rPr>
+        <w:t>{</w:t>
+      </w:r>
+      <w:r>
+        <w:rPr>
+          <w:bCs/>
+          <w:sz w:val="24"/>
+        </w:rPr>
+        <w:t xml:space="preserve">%- </w:t>
+      </w:r>
+      <w:r>
+        <w:rPr>
+          <w:bCs/>
+          <w:sz w:val="24"/>
+        </w:rPr>
+        <w:t xml:space="preserve">if </w:t>
+      </w:r>
+      <w:r>
+        <w:rPr>
+          <w:bCs/>
+          <w:sz w:val="24"/>
+        </w:rPr>
+        <w:t xml:space="preserve"> -%}</w:t>
+      </w:r>
+    </w:p>
+    <w:p>
+      <w:pPr>
         <w:numPr>
           <w:ilvl w:val="0"/>
           <w:numId w:val="2"/>
@@ -2960,12 +3289,58 @@
     </w:p>
     <w:p>
       <w:pPr>
-        <w:pStyle w:val="ListParagraph"/>
-        <w:rPr>
-          <w:bCs/>
-          <w:sz w:val="24"/>
-        </w:rPr>
-      </w:pPr>
+        <w:tabs>
+          <w:tab w:val="left" w:pos="720"/>
+          <w:tab w:val="left" w:pos="1440"/>
+          <w:tab w:val="left" w:pos="2160"/>
+          <w:tab w:val="left" w:pos="2880"/>
+          <w:tab w:val="left" w:pos="3600"/>
+          <w:tab w:val="left" w:pos="4320"/>
+          <w:tab w:val="left" w:pos="5040"/>
+          <w:tab w:val="left" w:pos="5760"/>
+          <w:tab w:val="left" w:pos="6480"/>
+          <w:tab w:val="left" w:pos="7200"/>
+          <w:tab w:val="left" w:pos="7920"/>
+        </w:tabs>
+        <w:suppressAutoHyphens/>
+        <w:ind w:right="1260"/>
+        <w:jc w:val="both"/>
+        <w:rPr>
+          <w:bCs/>
+          <w:sz w:val="24"/>
+        </w:rPr>
+      </w:pPr>
+    </w:p>
+    <w:p>
+      <w:pPr>
+        <w:tabs>
+          <w:tab w:val="left" w:pos="720"/>
+          <w:tab w:val="left" w:pos="1440"/>
+          <w:tab w:val="left" w:pos="2160"/>
+          <w:tab w:val="left" w:pos="2880"/>
+          <w:tab w:val="left" w:pos="3600"/>
+          <w:tab w:val="left" w:pos="4320"/>
+          <w:tab w:val="left" w:pos="5040"/>
+          <w:tab w:val="left" w:pos="5760"/>
+          <w:tab w:val="left" w:pos="6480"/>
+          <w:tab w:val="left" w:pos="7200"/>
+          <w:tab w:val="left" w:pos="7920"/>
+        </w:tabs>
+        <w:suppressAutoHyphens/>
+        <w:ind w:right="1260"/>
+        <w:jc w:val="both"/>
+        <w:rPr>
+          <w:bCs/>
+          <w:sz w:val="24"/>
+        </w:rPr>
+      </w:pPr>
+      <w:r>
+        <w:rPr>
+          <w:bCs/>
+          <w:sz w:val="24"/>
+        </w:rPr>
+        <w:t>{%- if  -%}</w:t>
+      </w:r>
     </w:p>
     <w:p>
       <w:pPr>
@@ -2999,6 +3374,65 @@
           <w:bCs/>
           <w:sz w:val="24"/>
         </w:rPr>
+        <w:t>Benefits loss to trial is {{r b2e_WLE_</w:t>
+      </w:r>
+      <w:r>
+        <w:rPr>
+          <w:bCs/>
+          <w:sz w:val="24"/>
+        </w:rPr>
+        <w:t>posttrial</w:t>
+      </w:r>
+      <w:r>
+        <w:rPr>
+          <w:bCs/>
+          <w:sz w:val="24"/>
+        </w:rPr>
+        <w:t>_benefits_notax }}</w:t>
+      </w:r>
+    </w:p>
+    <w:p>
+      <w:pPr>
+        <w:pStyle w:val="ListParagraph"/>
+        <w:rPr>
+          <w:bCs/>
+          <w:sz w:val="24"/>
+        </w:rPr>
+      </w:pPr>
+    </w:p>
+    <w:p>
+      <w:pPr>
+        <w:numPr>
+          <w:ilvl w:val="0"/>
+          <w:numId w:val="2"/>
+        </w:numPr>
+        <w:tabs>
+          <w:tab w:val="left" w:pos="720"/>
+          <w:tab w:val="left" w:pos="1440"/>
+          <w:tab w:val="left" w:pos="2160"/>
+          <w:tab w:val="left" w:pos="2880"/>
+          <w:tab w:val="left" w:pos="3600"/>
+          <w:tab w:val="left" w:pos="4320"/>
+          <w:tab w:val="left" w:pos="5040"/>
+          <w:tab w:val="left" w:pos="5760"/>
+          <w:tab w:val="left" w:pos="6480"/>
+          <w:tab w:val="left" w:pos="7200"/>
+          <w:tab w:val="left" w:pos="7920"/>
+        </w:tabs>
+        <w:suppressAutoHyphens/>
+        <w:ind w:right="1260"/>
+        <w:jc w:val="both"/>
+        <w:rPr>
+          <w:bCs/>
+          <w:sz w:val="24"/>
+        </w:rPr>
+      </w:pPr>
+      <w:r>
+        <w:rPr>
+          <w:bCs/>
+          <w:sz w:val="24"/>
+        </w:rPr>
+        <w:lastRenderedPageBreak/>
         <w:t xml:space="preserve">The present value of future medical costs ranges from </w:t>
       </w:r>
       <w:r>
@@ -3442,7 +3876,6 @@
                 <w:bCs/>
                 <w:sz w:val="24"/>
               </w:rPr>
-              <w:lastRenderedPageBreak/>
               <w:t xml:space="preserve">{{ </w:t>
             </w:r>
             <w:r>
@@ -5560,6 +5993,7 @@
           <w:sz w:val="24"/>
           <w:u w:val="single"/>
         </w:rPr>
+        <w:lastRenderedPageBreak/>
         <w:t>Post</w:t>
       </w:r>
       <w:r>
@@ -5913,7 +6347,6 @@
           <w:sz w:val="24"/>
           <w:u w:val="single"/>
         </w:rPr>
-        <w:lastRenderedPageBreak/>
         <w:t>Incremental Factors</w:t>
       </w:r>
       <w:r>
@@ -6784,7 +7217,15 @@
           <w:bCs/>
           <w:sz w:val="24"/>
         </w:rPr>
-        <w:t>date of birth, according to the 202</w:t>
+        <w:t xml:space="preserve">date of </w:t>
+      </w:r>
+      <w:r>
+        <w:rPr>
+          <w:bCs/>
+          <w:sz w:val="24"/>
+        </w:rPr>
+        <w:lastRenderedPageBreak/>
+        <w:t>birth, according to the 202</w:t>
       </w:r>
       <w:r>
         <w:rPr>
@@ -7191,7 +7632,6 @@
           <w:sz w:val="24"/>
           <w:u w:val="single"/>
         </w:rPr>
-        <w:lastRenderedPageBreak/>
         <w:t xml:space="preserve">Occupational Disability Losses from </w:t>
       </w:r>
       <w:r>
@@ -9934,7 +10374,27 @@
                 <w:szCs w:val="28"/>
                 <w:highlight w:val="red"/>
               </w:rPr>
-              <w:t>{{r 1be_credit }}</w:t>
+              <w:t xml:space="preserve">{{r </w:t>
+            </w:r>
+            <w:r>
+              <w:rPr>
+                <w:bCs/>
+                <w:iCs/>
+                <w:sz w:val="28"/>
+                <w:szCs w:val="28"/>
+                <w:highlight w:val="red"/>
+              </w:rPr>
+              <w:t>b1e</w:t>
+            </w:r>
+            <w:r>
+              <w:rPr>
+                <w:bCs/>
+                <w:iCs/>
+                <w:sz w:val="28"/>
+                <w:szCs w:val="28"/>
+                <w:highlight w:val="red"/>
+              </w:rPr>
+              <w:t>_credit }}</w:t>
             </w:r>
           </w:p>
           <w:p>
@@ -13164,7 +13624,15 @@
                 <w:smallCaps/>
                 <w:sz w:val="28"/>
               </w:rPr>
-              <w:t>1be_WLE_earnings</w:t>
+              <w:t>b1e</w:t>
+            </w:r>
+            <w:r>
+              <w:rPr>
+                <w:bCs/>
+                <w:smallCaps/>
+                <w:sz w:val="28"/>
+              </w:rPr>
+              <w:t>_WLE_earnings</w:t>
             </w:r>
             <w:r>
               <w:rPr>

</xml_diff>